<commit_message>
update comet accepted in resume and publications
</commit_message>
<xml_diff>
--- a/resume/CV-ZhaoYilong-Chinese.docx
+++ b/resume/CV-ZhaoYilong-Chinese.docx
@@ -1002,6 +1002,121 @@
           <w:rFonts w:ascii="Times New Roman" w:eastAsia="宋体" w:hAnsi="Times New Roman" w:cs="宋体"/>
           <w:lang w:eastAsia="zh-CN"/>
         </w:rPr>
+        <w:t>, Fangxin Liu, Onur Mutlu, Mingyu Gao, Jian Liu, Li Liang, and Haibing Guan, "COMET: A Cooperative Scheduling Framework for Concurrent PIM/CPU Execution on Mobile Devices</w:t>
+      </w:r>
+      <w:r>
+        <w:rPr>
+          <w:rFonts w:ascii="Times New Roman" w:eastAsia="宋体" w:hAnsi="Times New Roman" w:cs="宋体"/>
+          <w:i/>
+          <w:iCs/>
+          <w:lang w:eastAsia="zh-CN"/>
+        </w:rPr>
+        <w:t>", in Proceedings of the</w:t>
+      </w:r>
+      <w:r>
+        <w:rPr>
+          <w:rFonts w:ascii="Times New Roman" w:eastAsia="宋体" w:hAnsi="Times New Roman" w:cs="宋体"/>
+          <w:lang w:eastAsia="zh-CN"/>
+        </w:rPr>
+        <w:t xml:space="preserve"> </w:t>
+      </w:r>
+      <w:r>
+        <w:rPr>
+          <w:rFonts w:ascii="Times New Roman" w:eastAsia="宋体" w:hAnsi="Times New Roman" w:cs="宋体"/>
+          <w:i/>
+          <w:lang w:eastAsia="zh-CN"/>
+        </w:rPr>
+        <w:t>53st International Symposium on Computer Architecture</w:t>
+      </w:r>
+      <w:r>
+        <w:rPr>
+          <w:rFonts w:ascii="Times New Roman" w:eastAsia="宋体" w:hAnsi="Times New Roman" w:cs="宋体"/>
+          <w:lang w:eastAsia="zh-CN"/>
+        </w:rPr>
+        <w:t xml:space="preserve"> (</w:t>
+      </w:r>
+      <w:r>
+        <w:rPr>
+          <w:rFonts w:ascii="Times New Roman" w:eastAsia="宋体" w:hAnsi="Times New Roman" w:cs="宋体" w:hint="eastAsia"/>
+          <w:b/>
+          <w:bCs/>
+          <w:lang w:eastAsia="zh-CN"/>
+        </w:rPr>
+        <w:t>ISCA</w:t>
+      </w:r>
+      <w:r>
+        <w:rPr>
+          <w:rFonts w:ascii="Times New Roman" w:eastAsia="宋体" w:hAnsi="Times New Roman" w:cs="宋体"/>
+          <w:b/>
+          <w:bCs/>
+          <w:lang w:eastAsia="zh-CN"/>
+        </w:rPr>
+        <w:t>’26</w:t>
+      </w:r>
+      <w:r>
+        <w:rPr>
+          <w:rFonts w:ascii="Times New Roman" w:eastAsia="宋体" w:hAnsi="Times New Roman" w:cs="宋体" w:hint="eastAsia"/>
+          <w:b/>
+          <w:bCs/>
+          <w:lang w:eastAsia="zh-CN"/>
+        </w:rPr>
+        <w:t>,</w:t>
+      </w:r>
+      <w:r>
+        <w:rPr>
+          <w:rFonts w:ascii="Times New Roman" w:eastAsia="宋体" w:hAnsi="Times New Roman" w:cs="宋体"/>
+          <w:b/>
+          <w:bCs/>
+          <w:lang w:eastAsia="zh-CN"/>
+        </w:rPr>
+        <w:t xml:space="preserve"> </w:t>
+      </w:r>
+      <w:r>
+        <w:rPr>
+          <w:rFonts w:ascii="Times New Roman" w:eastAsia="宋体" w:hAnsi="Times New Roman" w:cs="宋体" w:hint="eastAsia"/>
+          <w:lang w:eastAsia="zh-CN"/>
+        </w:rPr>
+        <w:t>Acce</w:t>
+      </w:r>
+      <w:r>
+        <w:rPr>
+          <w:rFonts w:ascii="Times New Roman" w:eastAsia="宋体" w:hAnsi="Times New Roman" w:cs="宋体"/>
+          <w:lang w:eastAsia="zh-CN"/>
+        </w:rPr>
+        <w:t>pted)</w:t>
+      </w:r>
+    </w:p>
+    <w:p>
+      <w:pPr>
+        <w:pStyle w:val="Body"/>
+        <w:numPr>
+          <w:ilvl w:val="0"/>
+          <w:numId w:val="1"/>
+        </w:numPr>
+        <w:tabs>
+          <w:tab w:val="left" w:pos="720"/>
+          <w:tab w:val="left" w:pos="1080"/>
+        </w:tabs>
+        <w:spacing w:after="40"/>
+        <w:rPr>
+          <w:rFonts w:ascii="Times New Roman" w:eastAsia="宋体" w:hAnsi="Times New Roman" w:cs="宋体"/>
+          <w:lang w:eastAsia="zh-CN"/>
+        </w:rPr>
+      </w:pPr>
+      <w:r>
+        <w:rPr>
+          <w:rFonts w:ascii="Times New Roman" w:eastAsia="宋体" w:hAnsi="Times New Roman" w:cs="宋体"/>
+          <w:b/>
+          <w:bCs/>
+          <w:lang w:eastAsia="zh-CN"/>
+        </w:rPr>
+        <w:t>Yilong Zhao</w:t>
+      </w:r>
+      <w:r>
+        <w:rPr>
+          <w:rFonts w:ascii="Times New Roman" w:eastAsia="宋体" w:hAnsi="Times New Roman" w:cs="宋体"/>
+          <w:lang w:eastAsia="zh-CN"/>
+        </w:rPr>
         <w:t xml:space="preserve">, Fangxin Liu, Zongwu Wang, Mingjian Li, Mingxing Zhang, Chixiao Chen, and Li Jiang, </w:t>
       </w:r>
       <w:r>
@@ -1660,6 +1775,7 @@
           <w:sz w:val="22"/>
           <w:lang w:eastAsia="zh-CN"/>
         </w:rPr>
+        <w:lastRenderedPageBreak/>
         <w:t>刘方鑫</w:t>
       </w:r>
       <w:r>
@@ -1803,7 +1919,6 @@
           <w:rFonts w:ascii="Times New Roman" w:eastAsia="宋体" w:hAnsi="Times New Roman" w:cs="宋体" w:hint="eastAsia"/>
           <w:lang w:eastAsia="zh-CN"/>
         </w:rPr>
-        <w:lastRenderedPageBreak/>
         <w:t>蒋力，</w:t>
       </w:r>
       <w:r>

</xml_diff>